<commit_message>
added sfsac download option and links to bulk mdl
</commit_message>
<xml_diff>
--- a/_out/mdl/2024/MDL-TOWN_OF_ELKTON_VIRGINIA-546001261-2024.docx
+++ b/_out/mdl/2024/MDL-TOWN_OF_ELKTON_VIRGINIA-546001261-2024.docx
@@ -33,7 +33,7 @@
           <w:smallCaps w:val="0"/>
           <w:sz w:val="24"/>
         </w:rPr>
-        <w:t>March 11, 2026</w:t>
+        <w:t>March 24, 2026</w:t>
       </w:r>
     </w:p>
     <w:p>
@@ -266,7 +266,7 @@
           <w:b/>
           <w:sz w:val="24"/>
         </w:rPr>
-        <w:t>The Town of Elkton, Virginia</w:t>
+        <w:t>Town of Elkton, Virginia</w:t>
       </w:r>
       <w:r>
         <w:rPr>
@@ -339,11 +339,6 @@
           <w:sz w:val="24"/>
         </w:rPr>
         <w:br/>
-      </w:r>
-      <w:r>
-        <w:rPr>
-          <w:sz w:val="24"/>
-        </w:rPr>
         <w:t>21.027 / State and Local Fiscal Recovery Funds (SLFRF)</w:t>
       </w:r>
     </w:p>
@@ -424,9 +419,7 @@
                 <w:b/>
                 <w:sz w:val="24"/>
               </w:rPr>
-              <w:t>Compliance Type -</w:t>
-              <w:br/>
-              <w:t>Audit Finding Summary</w:t>
+              <w:t>Compliance Type</w:t>
             </w:r>
           </w:p>
         </w:tc>
@@ -540,30 +533,6 @@
                 <w:sz w:val="24"/>
               </w:rPr>
               <w:t>Other</w:t>
-            </w:r>
-            <w:r>
-              <w:rPr>
-                <w:sz w:val="24"/>
-              </w:rPr>
-              <w:t xml:space="preserve"> –</w:t>
-            </w:r>
-            <w:r>
-              <w:rPr>
-                <w:sz w:val="24"/>
-              </w:rPr>
-              <w:br/>
-            </w:r>
-            <w:r>
-              <w:rPr>
-                <w:sz w:val="24"/>
-              </w:rPr>
-              <w:br/>
-            </w:r>
-            <w:r>
-              <w:rPr>
-                <w:sz w:val="24"/>
-              </w:rPr>
-              <w:t>Lack of Written Policies and/or Procedures - Management of Federal Funds</w:t>
             </w:r>
           </w:p>
         </w:tc>
@@ -696,30 +665,6 @@
                 <w:sz w:val="24"/>
               </w:rPr>
               <w:t>Reporting</w:t>
-            </w:r>
-            <w:r>
-              <w:rPr>
-                <w:sz w:val="24"/>
-              </w:rPr>
-              <w:t xml:space="preserve"> –</w:t>
-            </w:r>
-            <w:r>
-              <w:rPr>
-                <w:sz w:val="24"/>
-              </w:rPr>
-              <w:br/>
-            </w:r>
-            <w:r>
-              <w:rPr>
-                <w:sz w:val="24"/>
-              </w:rPr>
-              <w:br/>
-            </w:r>
-            <w:r>
-              <w:rPr>
-                <w:sz w:val="24"/>
-              </w:rPr>
-              <w:t>Lack of Internal Controls- Equipment and Real Property Management</w:t>
             </w:r>
           </w:p>
         </w:tc>
@@ -860,30 +805,6 @@
                 <w:sz w:val="24"/>
               </w:rPr>
               <w:t>Procurement and suspension and debarment</w:t>
-            </w:r>
-            <w:r>
-              <w:rPr>
-                <w:sz w:val="24"/>
-              </w:rPr>
-              <w:t xml:space="preserve"> –</w:t>
-            </w:r>
-            <w:r>
-              <w:rPr>
-                <w:sz w:val="24"/>
-              </w:rPr>
-              <w:br/>
-            </w:r>
-            <w:r>
-              <w:rPr>
-                <w:sz w:val="24"/>
-              </w:rPr>
-              <w:br/>
-            </w:r>
-            <w:r>
-              <w:rPr>
-                <w:sz w:val="24"/>
-              </w:rPr>
-              <w:t>Lack of Federal Government Approval</w:t>
             </w:r>
           </w:p>
         </w:tc>

</xml_diff>